<commit_message>
Sync verified Breadboard sustainability mapping in program library
</commit_message>
<xml_diff>
--- a/subject-program-library/programs/Breadboard-25-Period-Teaching-Program-v2.1-Network-Benchmark.docx
+++ b/subject-program-library/programs/Breadboard-25-Period-Teaching-Program-v2.1-Network-Benchmark.docx
@@ -6622,7 +6622,7 @@
                 <w:color w:val="243024"/>
                 <w:sz w:val="19"/>
               </w:rPr>
-              <w:t>Accurate measuring and marking-out for timber projects</w:t>
+              <w:t>Investigate sustainable practices in the timber industry</w:t>
             </w:r>
             <w:r>
               <w:rPr>
@@ -6631,7 +6631,7 @@
                 <w:color w:val="174829"/>
                 <w:sz w:val="19"/>
               </w:rPr>
-              <w:t xml:space="preserve"> · INT5-PRO-01, INT5-INP-01, INT5-USE-01</w:t>
+              <w:t xml:space="preserve"> · INT5-ENV-01, INT5-USE-01</w:t>
             </w:r>
           </w:p>
         </w:tc>

</xml_diff>